<commit_message>
Refresh the 1.1.0 document-pair edition
Regenerate and publish the manager/engineering presentation and narrative for
the 1.1.0 cut. Correct the catalog surface counts to 9 languages, 5 build
systems and 9 package providers (adds TypeScript, Zig, Elixir, repo-man,
Cargo, npm and ZIP), and relabel the private repository's planned 1.2.0
edition as 1.1.0, since that work ships together in the first public release.

Co-Authored-By: Claude Opus 5.5 <noreply@anthropic.com>
</commit_message>
<xml_diff>
--- a/docs/presentations/literate-ai-manager-overview/literate-ai-manager-and-engineering-overview.docx
+++ b/docs/presentations/literate-ai-manager-overview/literate-ai-manager-and-engineering-overview.docx
@@ -29,7 +29,7 @@
           <w:color w:val="101317"/>
           <w:sz w:val="24"/>
         </w:rPr>
-        <w:t>This is the 1.2.0 edition of the narrative member of component://literate-ai/literate-ai-overview. It is the comprehensive technical account that accompanies the 26-slide presentation built from deck-specification.md. Both members share the factual ledger in source-notes.md and must not diverge on a shared claim. This edition is the major/minor regeneration required before the 1.2.0 cut. Tag v1.1.0 is already published; this document describes implemented candidate authority, does not claim that v1.2.0 is already published, and does not grant release authority.</w:t>
+        <w:t>This is the 1.1.0 edition of the narrative member of component://literate-ai/literate-ai-overview. It is the comprehensive technical account that accompanies the 26-slide presentation built from deck-specification.md. Both members share the factual ledger in source-notes.md and must not diverge on a shared claim. This edition is the major/minor regeneration required before the 1.1.0 cut, the first release from the public repository. This document describes implemented candidate authority, does not claim that v1.1.0 is already published, and does not grant release authority.</w:t>
       </w:r>
     </w:p>
     <w:p>
@@ -557,7 +557,7 @@
           <w:color w:val="101317"/>
           <w:sz w:val="24"/>
         </w:rPr>
-        <w:t>These figures measure catalog surface area, not maturity or Cartesian qualification. The live language Flavor matrix is Python 3.11+, C++17, Rust 2021, JavaScript with Node.js 20+, Swift with explicit Apple/Linux/Windows toolchain realizations, and Go. The live build-system Flavor matrix is Bazel, GNU Make, CMake, and Cargo. Bazel is a removable preference, never hard-coded authority. The live operating-system Flavor matrix is macOS, Linux, and Windows. The packaging Flavor catalog contains pip wheels, Conan, apt, Homebrew, WinGet, and Chocolatey. Compatible providers compose as independent selections. The current CLI provides exact, read-only multi-provider package planning and Standard-lifecycle-backed native construction and independent verification for deterministic pip wheels and portable Conan cache archives. Apt, Homebrew, WinGet, and Chocolatey construction remains open.</w:t>
+        <w:t>These figures measure catalog surface area, not maturity or Cartesian qualification. The live language Flavor matrix is Python 3.11+, C++17, Rust 2021, JavaScript with Node.js 20+, TypeScript, Swift with explicit Apple/Linux/Windows toolchain realizations, Go, Zig, and Elixir with Erlang/OTP 27+. The live build-system Flavor matrix is Bazel, GNU Make, CMake, Cargo, and repo-man. Bazel is a removable preference, never hard-coded authority. The live operating-system Flavor matrix is macOS, Linux, and Windows. The packaging Flavor catalog contains pip wheels, Conan, apt, Homebrew, WinGet, Chocolatey, Cargo, npm, and deterministic ZIP archives. Compatible providers compose as independent selections. The current CLI provides exact, read-only multi-provider package planning and Standard-lifecycle-backed native construction and independent verification for deterministic pip wheels and portable Conan cache archives. Apt, Homebrew, WinGet, and Chocolatey construction remains open.</w:t>
       </w:r>
     </w:p>
     <w:p>
@@ -1337,7 +1337,7 @@
           <w:color w:val="101317"/>
           <w:sz w:val="24"/>
         </w:rPr>
-        <w:t>Every major or minor cut runs a Python-owned contribution sweep over open issues, reviews, unmerged branches, and attached worktrees. The operator decides relevance; the sweep fails closed on unclassified work. Tracker dispositions and exact-head branch-lifecycle markers survive into the next cycle. Major and minor cuts also regenerate, independently verify, preflight, publish, and export back the terminal document pair using one explicit active gcloud account. Authority: docs/decisions/0034-continuous-evidence-bound-release-closure.md. This edition does not claim that tag v1.2.0 is already published.</w:t>
+        <w:t>Every major or minor cut runs a Python-owned contribution sweep over open issues, reviews, unmerged branches, and attached worktrees. The operator decides relevance; the sweep fails closed on unclassified work. Tracker dispositions and exact-head branch-lifecycle markers survive into the next cycle. Major and minor cuts also regenerate, independently verify, preflight, publish, and export back the terminal document pair using one explicit active gcloud account. Authority: docs/decisions/0034-continuous-evidence-bound-release-closure.md. This edition does not claim that tag v1.1.0 is already published.</w:t>
       </w:r>
     </w:p>
     <w:p>
@@ -1787,7 +1787,7 @@
           <w:color w:val="101317"/>
           <w:sz w:val="24"/>
         </w:rPr>
-        <w:t>The 1.1 native-custody and 1.0 operator and release boundaries remain implemented: contribution sweeps, document-pair publication, Standard lifecycle rebind, doctor, status, acknowledged create/adopt plans, explicit conversion stages, and an installed-wheel golden path. The 1.2 candidate adds dependency-aware bounded action scheduling, provider-neutral cache authority, real local Debian packages, native CLI and gRPC acceptance, and repository-owned worktree placement. The next horizon remains investment framing rather than a measured delivery guarantee.</w:t>
+        <w:t>Native custody and the 1.0 operator and release boundaries remain implemented: contribution sweeps, document-pair publication, Standard lifecycle rebind, doctor, status, acknowledged create/adopt plans, explicit conversion stages, and an installed-wheel golden path. The 1.1 candidate adds dependency-aware bounded action scheduling, provider-neutral cache authority, real local Debian packages, native CLI and gRPC acceptance, and repository-owned worktree placement. The next horizon remains investment framing rather than a measured delivery guarantee.</w:t>
       </w:r>
     </w:p>
     <w:p>
@@ -1817,7 +1817,7 @@
           <w:color w:val="101317"/>
           <w:sz w:val="24"/>
         </w:rPr>
-        <w:t>Installed 1.2 projects retain the project-independent doctor, status over existing authority, lock, receipt, tracker, and host services, acknowledged create/adopt plans, and explicit wrapped, retained, drafted, and qualified stages. Original source remains release authority until current regenerative qualification. A release-candidate-wheel gate proves create through a validated hello project and adopt through a current retained receipt. These are implemented candidate claims inherited from 1.0, not a claim that v1.2.0 is already published.</w:t>
+        <w:t>Installed 1.1 projects retain the project-independent doctor, status over existing authority, lock, receipt, tracker, and host services, acknowledged create/adopt plans, and explicit wrapped, retained, drafted, and qualified stages. Original source remains release authority until current regenerative qualification. A release-candidate-wheel gate proves create through a validated hello project and adopt through a current retained receipt. These are implemented candidate claims inherited from 1.0, not a claim that v1.1.0 is already published.</w:t>
       </w:r>
     </w:p>
     <w:p>
@@ -1847,7 +1847,7 @@
           <w:color w:val="101317"/>
           <w:sz w:val="24"/>
         </w:rPr>
-        <w:t>The 1.2 candidate projects exact lifecycle actions into a deterministic dependency DAG and dispatches newly ready work through bounded capability-matched slots while isolating descendant cancellation and rejecting changed recovery routes. Local and HTTPS/WebDAV cache authority projects to Bazel and sccache, and immutable test, package, and container objects are rehashed before reuse. The package-apt path constructs and independently inspects real deterministic Debian archives on Linux. Native CLI and native gRPC acceptance retain exact executable, stream, filesystem, descriptor, transport, deadline, status, evidence, and shutdown boundaries.</w:t>
+        <w:t>The 1.1 candidate projects exact lifecycle actions into a deterministic dependency DAG and dispatches newly ready work through bounded capability-matched slots while isolating descendant cancellation and rejecting changed recovery routes. Local and HTTPS/WebDAV cache authority projects to Bazel and sccache, and immutable test, package, and container objects are rehashed before reuse. The package-apt path constructs and independently inspects real deterministic Debian archives on Linux. Native CLI and native gRPC acceptance retain exact executable, stream, filesystem, descriptor, transport, deadline, status, evidence, and shutdown boundaries.</w:t>
       </w:r>
     </w:p>
     <w:p>
@@ -2027,7 +2027,7 @@
           <w:color w:val="101317"/>
           <w:sz w:val="24"/>
         </w:rPr>
-        <w:t>Use the operator front door on one demanding downstream application and carry it through an explicit retained receipt. Use the next investment cycle for production containment and operational hardening while preserving the architecture needed for many. The requested decision is production-hardening investment plus selection of that first downstream 1.2 production adoption.</w:t>
+        <w:t>Use the operator front door on one demanding downstream application and carry it through an explicit retained receipt. Use the next investment cycle for production containment and operational hardening while preserving the architecture needed for many. The requested decision is production-hardening investment plus selection of that first downstream 1.1 production adoption.</w:t>
       </w:r>
     </w:p>
     <w:p>
@@ -2057,7 +2057,7 @@
           <w:color w:val="101317"/>
           <w:sz w:val="24"/>
         </w:rPr>
-        <w:t>Build for the portfolio from the first application: current gates, no shortcuts, and a regeneratable knowledge system rather than another copied implementation. The published presentation and this narrative are the 1.2.0 edition of that argument. They do not grant release authority.</w:t>
+        <w:t>Build for the portfolio from the first application: current gates, no shortcuts, and a regeneratable knowledge system rather than another copied implementation. The published presentation and this narrative are the 1.1.0 edition of that argument. They do not grant release authority.</w:t>
       </w:r>
     </w:p>
     <w:sectPr>

</xml_diff>

<commit_message>
Regenerate the 1.2.0 document-pair edition
Revalidate the factual ledger against the merged 1.2 line and regenerate the
manager/engineering presentation and narrative for the 1.2.0 minor cut.
Correct the release gate count to 15 (public-export-check) and the build-system
Flavor count to six (build-mix); package providers stay nine, with Hex recorded
as a build-mix toolchain constraint and pinned dependency input rather than a
provider. Revise slide 23 and add a narrative 8.1.3 section for bounded
candidate repair, cross-host action workers and the standard receiver,
Elixir/Mix, and forge-default coordination, keeping #2 and #4 deferred to 1.3.
Local acceptance passes all 11 scenarios (26 slides, 73 headings); Google
publication is pending.

Co-Authored-By: Claude Opus 5.5 <noreply@anthropic.com>
</commit_message>
<xml_diff>
--- a/docs/presentations/literate-ai-manager-overview/literate-ai-manager-and-engineering-overview.docx
+++ b/docs/presentations/literate-ai-manager-overview/literate-ai-manager-and-engineering-overview.docx
@@ -29,7 +29,7 @@
           <w:color w:val="101317"/>
           <w:sz w:val="24"/>
         </w:rPr>
-        <w:t>This is the 1.1.0 edition of the narrative member of component://literate-ai/literate-ai-overview. It is the comprehensive technical account that accompanies the 26-slide presentation built from deck-specification.md. Both members share the factual ledger in source-notes.md and must not diverge on a shared claim. This edition is the major/minor regeneration required before the 1.1.0 cut, the first release from the public repository. This document describes implemented candidate authority, does not claim that v1.1.0 is already published, and does not grant release authority.</w:t>
+        <w:t>This is the 1.2.0 edition of the narrative member of component://literate-ai/literate-ai-overview. It is the comprehensive technical account that accompanies the 26-slide presentation built from deck-specification.md. Both members share the factual ledger in source-notes.md and must not diverge on a shared claim. This edition is the major/minor regeneration required before the 1.2.0 cut. Tag v1.1.0 is already published; this document describes implemented candidate authority, does not claim that v1.2.0 is already published, and does not grant release authority.</w:t>
       </w:r>
     </w:p>
     <w:p>
@@ -557,7 +557,7 @@
           <w:color w:val="101317"/>
           <w:sz w:val="24"/>
         </w:rPr>
-        <w:t>These figures measure catalog surface area, not maturity or Cartesian qualification. The live language Flavor matrix is Python 3.11+, C++17, Rust 2021, JavaScript with Node.js 20+, TypeScript, Swift with explicit Apple/Linux/Windows toolchain realizations, Go, Zig, and Elixir with Erlang/OTP 27+. The live build-system Flavor matrix is Bazel, GNU Make, CMake, Cargo, and repo-man. Bazel is a removable preference, never hard-coded authority. The live operating-system Flavor matrix is macOS, Linux, and Windows. The packaging Flavor catalog contains pip wheels, Conan, apt, Homebrew, WinGet, Chocolatey, Cargo, npm, and deterministic ZIP archives. Compatible providers compose as independent selections. The current CLI provides exact, read-only multi-provider package planning and Standard-lifecycle-backed native construction and independent verification for deterministic pip wheels and portable Conan cache archives. Apt, Homebrew, WinGet, and Chocolatey construction remains open.</w:t>
+        <w:t>These figures measure catalog surface area, not maturity or Cartesian qualification. The live language Flavor matrix is Python 3.11+, C++17, Rust 2021, JavaScript with Node.js 20+, TypeScript, Swift with explicit Apple/Linux/Windows toolchain realizations, Go, Zig, and Elixir with Erlang/OTP 27+. The live build-system Flavor matrix is Bazel, GNU Make, CMake, Cargo, Mix, and repo-man; Mix is new in 1.2. Bazel is a removable preference, never hard-coded authority. The live operating-system Flavor matrix is macOS, Linux, and Windows. The packaging Flavor catalog contains pip wheels, Conan, apt, Homebrew, WinGet, Chocolatey, Cargo, npm, and deterministic ZIP archives. Hex is not a package-provider Flavor: build-mix contributes a Hex toolchain constraint (flavors/build-mix/hex.json), and Hex packages are checksum-pinned dependency inputs rather than an output format. Compatible providers compose as independent selections. The current CLI provides exact, read-only multi-provider package planning and Standard-lifecycle-backed native construction and independent verification for deterministic pip wheels, portable Conan cache archives, and local Debian packages on compatible Linux hosts. Homebrew, WinGet, and Chocolatey construction remains open.</w:t>
       </w:r>
     </w:p>
     <w:p>
@@ -962,7 +962,7 @@
           <w:color w:val="101317"/>
           <w:sz w:val="24"/>
         </w:rPr>
-        <w:t>Current litai help exposes help, version, design, release, package, flavor, perf, matrix, config, work, document, worker, init, cache, skills, prompt, catalog, graph, build, test, run, verify, update, reparent, learn, lock, component, clean, really-clean, project, plan, generate, rebuild, profile, and spec. Diagnostic and deterministic connector verbs do not authorize a release. Native build and package managers remain delegated execution engines, never specification authority. Parser authority: src/literate_ai/cli/source_to_specification.py.</w:t>
+        <w:t>Current litai help exposes help, version, status, doctor, orchestrate, onboard, design, release, package, flavor, perf, matrix, config, work, video, document, worker, init, cache, skills, prompt, catalog, graph, render, build, test, run, verify, update, reparent, learn, lock, component, clean, really-clean, project, plan, generate, rebuild, profile, and spec. Diagnostic and deterministic connector verbs do not authorize a release. Native build and package managers remain delegated execution engines, never specification authority. Parser authority: src/literate_ai/cli/source_to_specification.py.</w:t>
       </w:r>
     </w:p>
     <w:p>
@@ -1337,7 +1337,7 @@
           <w:color w:val="101317"/>
           <w:sz w:val="24"/>
         </w:rPr>
-        <w:t>Every major or minor cut runs a Python-owned contribution sweep over open issues, reviews, unmerged branches, and attached worktrees. The operator decides relevance; the sweep fails closed on unclassified work. Tracker dispositions and exact-head branch-lifecycle markers survive into the next cycle. Major and minor cuts also regenerate, independently verify, preflight, publish, and export back the terminal document pair using one explicit active gcloud account. Authority: docs/decisions/0034-continuous-evidence-bound-release-closure.md. This edition does not claim that tag v1.1.0 is already published.</w:t>
+        <w:t>Every major or minor cut runs a Python-owned contribution sweep over open issues, reviews, unmerged branches, and attached worktrees. The operator decides relevance; the sweep fails closed on unclassified work. Tracker dispositions and exact-head branch-lifecycle markers survive into the next cycle. Major and minor cuts also regenerate, independently verify, preflight, publish, and export back the terminal document pair using one explicit active gcloud account. Authority: docs/decisions/0034-continuous-evidence-bound-release-closure.md. This edition does not claim that tag v1.2.0 is already published.</w:t>
       </w:r>
     </w:p>
     <w:p>
@@ -1397,7 +1397,7 @@
           <w:color w:val="101317"/>
           <w:sz w:val="24"/>
         </w:rPr>
-        <w:t>The Makefile RELEASE_GATES list is fourteen names: repository-layout-check, python-check, lint, format-check, openspec-check, documentation-check, driver-review, skills-check, installed-e2e, wheel-check, install-check, installed-project-e2e, samples, test-receipt-current. There is no codegraph-ready gate.</w:t>
+        <w:t>The Makefile RELEASE_GATES list is fifteen names: repository-layout-check, public-export-check, python-check, lint, format-check, openspec-check, documentation-check, driver-review, skills-check, installed-e2e, wheel-check, install-check, installed-project-e2e, samples, test-receipt-current. 1.2 added public-export-check, so an organization-internal reference in tracked files fails the release gate instead of surfacing only at export. There is no codegraph-ready gate.</w:t>
       </w:r>
     </w:p>
     <w:p>
@@ -1457,7 +1457,7 @@
           <w:color w:val="101317"/>
           <w:sz w:val="24"/>
         </w:rPr>
-        <w:t>litai release check --target local|github|gitlab accepts all three target names, but GitLab is recognized and fail-closed as unsupported rather than dispatched. Local and GitHub execution use the same declared gate command (make release-check). A GitHub Actions --target github pass is not a substitute claim that local fan-out ran. v0.7.1 was published from release/0.7.x via --target github.</w:t>
+        <w:t>litai release check --target local|github|gitlab accepts all three target names, but GitLab is recognized and fail-closed as unsupported rather than dispatched. Local and GitHub execution use the same declared gate command (make release-check). A GitHub Actions --target github pass is not a substitute claim that local fan-out ran. v0.7.1 was published from release/0.7.x via --target github. In 1.2, release operations require an explicit SemVer policy, and when the policy declares qualification the default is a tiered target: each platform-by-action cell is covered by the leftmost tier that can run it — the host running the coding CLI, then one workers.json worker per remaining platform, then CI — and litai release qualify records exact-HEAD coverage. Authority: docs/architecture/project-releases.md.</w:t>
       </w:r>
     </w:p>
     <w:p>
@@ -1787,7 +1787,7 @@
           <w:color w:val="101317"/>
           <w:sz w:val="24"/>
         </w:rPr>
-        <w:t>Native custody and the 1.0 operator and release boundaries remain implemented: contribution sweeps, document-pair publication, Standard lifecycle rebind, doctor, status, acknowledged create/adopt plans, explicit conversion stages, and an installed-wheel golden path. The 1.1 candidate adds dependency-aware bounded action scheduling, provider-neutral cache authority, real local Debian packages, native CLI and gRPC acceptance, and repository-owned worktree placement. The next horizon remains investment framing rather than a measured delivery guarantee.</w:t>
+        <w:t>Native custody and the 1.0 operator and release boundaries remain implemented: contribution sweeps, document-pair publication, Standard lifecycle rebind, doctor, status, acknowledged create/adopt plans, explicit conversion stages, and an installed-wheel golden path. 1.1 added dependency-aware bounded action scheduling, provider-neutral cache authority, real local Debian packages, native CLI and gRPC acceptance, and repository-owned worktree placement. The 1.2 candidate adds bounded candidate repair, cross-host action workers, native Mix builds, and forge coordination. The next horizon remains investment framing rather than a measured delivery guarantee.</w:t>
       </w:r>
     </w:p>
     <w:p>
@@ -1817,7 +1817,7 @@
           <w:color w:val="101317"/>
           <w:sz w:val="24"/>
         </w:rPr>
-        <w:t>Installed 1.1 projects retain the project-independent doctor, status over existing authority, lock, receipt, tracker, and host services, acknowledged create/adopt plans, and explicit wrapped, retained, drafted, and qualified stages. Original source remains release authority until current regenerative qualification. A release-candidate-wheel gate proves create through a validated hello project and adopt through a current retained receipt. These are implemented candidate claims inherited from 1.0, not a claim that v1.1.0 is already published.</w:t>
+        <w:t>Installed 1.2 projects retain the project-independent doctor, status over existing authority, lock, receipt, tracker, and host services, acknowledged create/adopt plans, and explicit wrapped, retained, drafted, and qualified stages. Original source remains release authority until current regenerative qualification. A release-candidate-wheel gate proves create through a validated hello project and adopt through a current retained receipt. These are implemented candidate claims inherited from 1.0, not a claim that v1.2.0 is already published.</w:t>
       </w:r>
     </w:p>
     <w:p>
@@ -1847,7 +1847,7 @@
           <w:color w:val="101317"/>
           <w:sz w:val="24"/>
         </w:rPr>
-        <w:t>The 1.1 candidate projects exact lifecycle actions into a deterministic dependency DAG and dispatches newly ready work through bounded capability-matched slots while isolating descendant cancellation and rejecting changed recovery routes. Local and HTTPS/WebDAV cache authority projects to Bazel and sccache, and immutable test, package, and container objects are rehashed before reuse. The package-apt path constructs and independently inspects real deterministic Debian archives on Linux. Native CLI and native gRPC acceptance retain exact executable, stream, filesystem, descriptor, transport, deadline, status, evidence, and shutdown boundaries.</w:t>
+        <w:t>The 1.1 release projects exact lifecycle actions into a deterministic dependency DAG and dispatches newly ready work through bounded capability-matched slots while isolating descendant cancellation and rejecting changed recovery routes. Local and HTTPS/WebDAV cache authority projects to Bazel and sccache, and immutable test, package, and container objects are rehashed before reuse. The package-apt path constructs and independently inspects real deterministic Debian archives on Linux. Native CLI and native gRPC acceptance retain exact executable, stream, filesystem, descriptor, transport, deadline, status, evidence, and shutdown boundaries.</w:t>
       </w:r>
     </w:p>
     <w:p>
@@ -1862,7 +1862,82 @@
           <w:color w:val="101317"/>
           <w:sz w:val="24"/>
         </w:rPr>
-        <w:t>Those are bounded implemented slices, not a claim of complete production lifecycle composition. Production command and SSH dispatch, measured real LAN warm-cache hits, remote native-package custody, complete synthetic native-CLI lifecycle proof, and audited legacy-worktree retirement remain open under explicit 1.3 trackers.</w:t>
+        <w:t>Those are bounded implemented slices, not a claim of complete production lifecycle composition. Production command and SSH dispatch, measured real LAN warm-cache hits, remote native-package custody, complete synthetic native-CLI lifecycle proof, and audited legacy-worktree retirement remain open. Production action-DAG dispatch with multi-worker shared LAN-cache qualification (issue #4) is deferred to 1.3 by maintainer decision.</w:t>
+      </w:r>
+    </w:p>
+    <w:p>
+      <w:pPr>
+        <w:pStyle w:val="Heading3"/>
+      </w:pPr>
+      <w:r>
+        <w:rPr>
+          <w:rFonts w:ascii="Calibri" w:hAnsi="Calibri" w:cs="Calibri"/>
+          <w:b/>
+          <w:i w:val="0"/>
+          <w:color w:val="101317"/>
+          <w:sz w:val="32"/>
+        </w:rPr>
+        <w:t>What 1.2 adds: bounded repair, cross-host workers, Mix, and forge coordination</w:t>
+      </w:r>
+    </w:p>
+    <w:p>
+      <w:pPr>
+        <w:spacing w:after="200" w:line="240" w:lineRule="auto"/>
+      </w:pPr>
+      <w:r>
+        <w:rPr>
+          <w:rFonts w:ascii="Calibri" w:hAnsi="Calibri" w:cs="Calibri"/>
+          <w:b w:val="0"/>
+          <w:i w:val="0"/>
+          <w:color w:val="101317"/>
+          <w:sz w:val="24"/>
+        </w:rPr>
+        <w:t>litai rebuild now runs bounded candidate repair: a retryable build or generated-test rejection requests up to two fresh replacement candidates, each in its own durable attempt chained to the rejected one, and the rebuild result's repair field reports the replacements that ran. The conformance sample runner retains a bounded, redacted diagnostic excerpt — builder output for build rejections, generated expected and observed values for generated-test mismatches — in retained evidence and in the next attempt's repair feedback. Authority: src/literate_ai/adapters/candidate_repair.py, tests/conformance/support/sample_runner.py, and tests/smoke/test_candidate_rejection_diagnostics.py.</w:t>
+      </w:r>
+    </w:p>
+    <w:p>
+      <w:pPr>
+        <w:spacing w:after="200" w:line="240" w:lineRule="auto"/>
+      </w:pPr>
+      <w:r>
+        <w:rPr>
+          <w:rFonts w:ascii="Calibri" w:hAnsi="Calibri" w:cs="Calibri"/>
+          <w:b w:val="0"/>
+          <w:i w:val="0"/>
+          <w:color w:val="101317"/>
+          <w:sz w:val="24"/>
+        </w:rPr>
+        <w:t>When BUILD, TEST, EXECUTE and FINALIZE all run on admitted workers, litai rebuild derives locked toolchain identities, commands and native dependencies from the worker, so the controller needs none of the project's tools. python -m literate_ai.standard_receiver is a reference action receiver for portable single-Component Make/Python Standard projects, and FINALIZE grants are checked in both the receiver's parent and child. Production worker grant provisioning and complete CLI rebuild qualification remain pending. Authority: src/literate_ai/standard_receiver.py and docs/architecture/component-execution-plans.md.</w:t>
+      </w:r>
+    </w:p>
+    <w:p>
+      <w:pPr>
+        <w:spacing w:after="200" w:line="240" w:lineRule="auto"/>
+      </w:pPr>
+      <w:r>
+        <w:rPr>
+          <w:rFonts w:ascii="Calibri" w:hAnsi="Calibri" w:cs="Calibri"/>
+          <w:b w:val="0"/>
+          <w:i w:val="0"/>
+          <w:color w:val="101317"/>
+          <w:sz w:val="24"/>
+        </w:rPr>
+        <w:t>The build-mix Flavor and mix-build-system skill build native Elixir Mix applications and libraries. The source BOM pins each Hex package's exact version, checksums and requirements; ranges are refused, the native lock must equal those pins before anything compiles, and each extracted dependency is replaced by bytes from its verified archive. Mix builds are local-only in 1.2. Authority: flavors/build-mix/ and skills/specification-to-source/mix-build-system/.</w:t>
+      </w:r>
+    </w:p>
+    <w:p>
+      <w:pPr>
+        <w:spacing w:after="200" w:line="240" w:lineRule="auto"/>
+      </w:pPr>
+      <w:r>
+        <w:rPr>
+          <w:rFonts w:ascii="Calibri" w:hAnsi="Calibri" w:cs="Calibri"/>
+          <w:b w:val="0"/>
+          <w:i w:val="0"/>
+          <w:color w:val="101317"/>
+          <w:sz w:val="24"/>
+        </w:rPr>
+        <w:t>Forge issues and pull or merge requests are the default tracker and agent coordination channel; Gerrit or another system is an explicit override (ADR 0050). litai prompt translate recognizes the generic external envelope (literate-ai/prompt-task@2). Remote live gates still require opencode but no longer require OPENAI_API_KEY (ADR 0017 amendment). Skill-catalog discovery now runs once per validation operation, removing most of the filesystem calls that slowed Windows gates. Clean three-way update merging (issue #2) remains deferred to 1.3; 1.2 keeps plan-only update reviews.</w:t>
       </w:r>
     </w:p>
     <w:p>
@@ -2027,7 +2102,7 @@
           <w:color w:val="101317"/>
           <w:sz w:val="24"/>
         </w:rPr>
-        <w:t>Use the operator front door on one demanding downstream application and carry it through an explicit retained receipt. Use the next investment cycle for production containment and operational hardening while preserving the architecture needed for many. The requested decision is production-hardening investment plus selection of that first downstream 1.1 production adoption.</w:t>
+        <w:t>Use the operator front door on one demanding downstream application and carry it through an explicit retained receipt. Use the next investment cycle for production containment and operational hardening while preserving the architecture needed for many. The requested decision is production-hardening investment plus selection of that first downstream 1.2 production adoption.</w:t>
       </w:r>
     </w:p>
     <w:p>
@@ -2057,7 +2132,7 @@
           <w:color w:val="101317"/>
           <w:sz w:val="24"/>
         </w:rPr>
-        <w:t>Build for the portfolio from the first application: current gates, no shortcuts, and a regeneratable knowledge system rather than another copied implementation. The published presentation and this narrative are the 1.1.0 edition of that argument. They do not grant release authority.</w:t>
+        <w:t>Build for the portfolio from the first application: current gates, no shortcuts, and a regeneratable knowledge system rather than another copied implementation. The presentation and this narrative are the 1.2.0 edition of that argument. They do not grant release authority.</w:t>
       </w:r>
     </w:p>
     <w:sectPr>

</xml_diff>

<commit_message>
Tighten 1.2.0 document-pair repair and update claims; legible slide 23 header
Independent review of 041b3f09. litai rebuild's repair prompt carries a bounded,
sanitized failure fact, not a raw excerpt; the redacted diagnostic excerpt is a
conformance-harness record, so slide 23 and the specs no longer conflate them.
litai update --apply exists in 1.2, so the deferred-#2 wording now says conflict
review is plan-only and apply preserves conflicts. Slide 18 notes scope Debian
construction to compatible Linux hosts. Slide 23 gains a header wash so its title
and subtitle stay legible over the photograph. Acceptance re-passes 11/11
(26 slides, 73 headings); recorded digests updated.

Co-Authored-By: Claude Opus 5.5 <noreply@anthropic.com>
</commit_message>
<xml_diff>
--- a/docs/presentations/literate-ai-manager-overview/literate-ai-manager-and-engineering-overview.docx
+++ b/docs/presentations/literate-ai-manager-overview/literate-ai-manager-and-engineering-overview.docx
@@ -1892,7 +1892,7 @@
           <w:color w:val="101317"/>
           <w:sz w:val="24"/>
         </w:rPr>
-        <w:t>litai rebuild now runs bounded candidate repair: a retryable build or generated-test rejection requests up to two fresh replacement candidates, each in its own durable attempt chained to the rejected one, and the rebuild result's repair field reports the replacements that ran. The conformance sample runner retains a bounded, redacted diagnostic excerpt — builder output for build rejections, generated expected and observed values for generated-test mismatches — in retained evidence and in the next attempt's repair feedback. Authority: src/literate_ai/adapters/candidate_repair.py, tests/conformance/support/sample_runner.py, and tests/smoke/test_candidate_rejection_diagnostics.py.</w:t>
+        <w:t>litai rebuild now runs bounded candidate repair: a retryable build or generated-test rejection requests up to two fresh replacement candidates, each in its own durable attempt chained to the rejected one, and the rebuild result's repair field reports the replacements that ran. The repair prompt carries only a bounded, sanitized failure fact. Separately, the conformance sample runner retains a bounded, redacted diagnostic excerpt — builder output for build rejections, generated expected and observed values for generated-test mismatches — in retained evidence and in the next attempt's repair feedback. Authority: src/literate_ai/adapters/candidate_repair.py, tests/conformance/support/sample_runner.py, and tests/smoke/test_candidate_rejection_diagnostics.py.</w:t>
       </w:r>
     </w:p>
     <w:p>
@@ -1937,7 +1937,7 @@
           <w:color w:val="101317"/>
           <w:sz w:val="24"/>
         </w:rPr>
-        <w:t>Forge issues and pull or merge requests are the default tracker and agent coordination channel; Gerrit or another system is an explicit override (ADR 0050). litai prompt translate recognizes the generic external envelope (literate-ai/prompt-task@2). Remote live gates still require opencode but no longer require OPENAI_API_KEY (ADR 0017 amendment). Skill-catalog discovery now runs once per validation operation, removing most of the filesystem calls that slowed Windows gates. Clean three-way update merging (issue #2) remains deferred to 1.3; 1.2 keeps plan-only update reviews.</w:t>
+        <w:t>Forge issues and pull or merge requests are the default tracker and agent coordination channel; Gerrit or another system is an explicit override (ADR 0050). litai prompt translate recognizes the generic external envelope (literate-ai/prompt-task@2). Remote live gates still require opencode but no longer require OPENAI_API_KEY (ADR 0017 amendment). Skill-catalog discovery now runs once per validation operation, removing most of the filesystem calls that slowed Windows gates. Clean three-way update merging and reviewed resolution application (issue #2) remain deferred to 1.3; in 1.2, conflict review is plan-only and update apply preserves conflicts.</w:t>
       </w:r>
     </w:p>
     <w:p>

</xml_diff>

<commit_message>
docs: prepare 1.3 release collateral
</commit_message>
<xml_diff>
--- a/docs/presentations/literate-ai-manager-overview/literate-ai-manager-and-engineering-overview.docx
+++ b/docs/presentations/literate-ai-manager-overview/literate-ai-manager-and-engineering-overview.docx
@@ -29,7 +29,7 @@
           <w:color w:val="101317"/>
           <w:sz w:val="24"/>
         </w:rPr>
-        <w:t>This is the 1.2.0 edition of the narrative member of component://literate-ai/literate-ai-overview. It is the comprehensive technical account that accompanies the 26-slide presentation built from deck-specification.md. Both members share the factual ledger in source-notes.md and must not diverge on a shared claim. This edition is the major/minor regeneration required before the 1.2.0 cut. Tag v1.1.0 is already published; this document describes implemented candidate authority, does not claim that v1.2.0 is already published, and does not grant release authority.</w:t>
+        <w:t>This is the 1.3.0 edition of the narrative member of component://literate-ai/literate-ai-overview. It is the comprehensive technical account that accompanies the 26-slide presentation built from deck-specification.md. Both members share the factual ledger in source-notes.md and must not diverge on a shared claim. This edition is the major/minor regeneration required before the 1.3.0 cut. Tag v1.2.0 is already published; this document describes implemented candidate authority, does not claim that v1.3.0 is already published, and does not grant release authority.</w:t>
       </w:r>
     </w:p>
     <w:p>
@@ -1337,7 +1337,7 @@
           <w:color w:val="101317"/>
           <w:sz w:val="24"/>
         </w:rPr>
-        <w:t>Every major or minor cut runs a Python-owned contribution sweep over open issues, reviews, unmerged branches, and attached worktrees. The operator decides relevance; the sweep fails closed on unclassified work. Tracker dispositions and exact-head branch-lifecycle markers survive into the next cycle. Major and minor cuts also regenerate, independently verify, preflight, publish, and export back the terminal document pair using one explicit active gcloud account. Authority: docs/decisions/0034-continuous-evidence-bound-release-closure.md. This edition does not claim that tag v1.2.0 is already published.</w:t>
+        <w:t>Every major or minor cut runs a Python-owned contribution sweep over open issues, reviews, unmerged branches, and attached worktrees. The operator decides relevance; the sweep fails closed on unclassified work. Tracker dispositions and exact-head branch-lifecycle markers survive into the next cycle. Major and minor cuts also regenerate, independently verify, preflight, publish, and export back the terminal document pair using one explicit active gcloud account. Authority: docs/decisions/0034-continuous-evidence-bound-release-closure.md. This edition does not claim that tag v1.3.0 is already published.</w:t>
       </w:r>
     </w:p>
     <w:p>
@@ -1787,7 +1787,7 @@
           <w:color w:val="101317"/>
           <w:sz w:val="24"/>
         </w:rPr>
-        <w:t>Native custody and the 1.0 operator and release boundaries remain implemented: contribution sweeps, document-pair publication, Standard lifecycle rebind, doctor, status, acknowledged create/adopt plans, explicit conversion stages, and an installed-wheel golden path. 1.1 added dependency-aware bounded action scheduling, provider-neutral cache authority, real local Debian packages, native CLI and gRPC acceptance, and repository-owned worktree placement. The 1.2 candidate adds bounded candidate repair, cross-host action workers, native Mix builds, and forge coordination. The next horizon remains investment framing rather than a measured delivery guarantee.</w:t>
+        <w:t>Native custody and the 1.0 operator and release boundaries remain implemented: contribution sweeps, document-pair publication, Standard lifecycle rebind, doctor, status, acknowledged create/adopt plans, explicit conversion stages, and an installed-wheel golden path. 1.1 added dependency-aware bounded action scheduling, provider-neutral cache authority, real local Debian packages, native CLI and gRPC acceptance, and repository-owned worktree placement. The 1.2 release added bounded candidate repair, cross-host action workers, native Mix builds, and forge coordination. The 1.3 candidate adds reviewed original-source binding, target-bound Python projection, FreeBSD worker and target foundations, native SDK tree custody, and retained hardening. The next horizon remains investment framing rather than a measured delivery guarantee.</w:t>
       </w:r>
     </w:p>
     <w:p>
@@ -1817,7 +1817,7 @@
           <w:color w:val="101317"/>
           <w:sz w:val="24"/>
         </w:rPr>
-        <w:t>Installed 1.2 projects retain the project-independent doctor, status over existing authority, lock, receipt, tracker, and host services, acknowledged create/adopt plans, and explicit wrapped, retained, drafted, and qualified stages. Original source remains release authority until current regenerative qualification. A release-candidate-wheel gate proves create through a validated hello project and adopt through a current retained receipt. These are implemented candidate claims inherited from 1.0, not a claim that v1.2.0 is already published.</w:t>
+        <w:t>Installed 1.3 projects retain the project-independent doctor, status over existing authority, lock, receipt, tracker, and host services, acknowledged create/adopt plans, and explicit wrapped, retained, drafted, and qualified stages. Original source remains release authority until current regenerative qualification. A release-candidate-wheel gate proves create through a validated hello project and adopt through a current retained receipt. These are implemented candidate claims inherited from 1.0, not a claim that v1.3.0 is already published.</w:t>
       </w:r>
     </w:p>
     <w:p>
@@ -1862,7 +1862,7 @@
           <w:color w:val="101317"/>
           <w:sz w:val="24"/>
         </w:rPr>
-        <w:t>Those are bounded implemented slices, not a claim of complete production lifecycle composition. Production command and SSH dispatch, measured real LAN warm-cache hits, remote native-package custody, complete synthetic native-CLI lifecycle proof, and audited legacy-worktree retirement remain open. Production action-DAG dispatch with multi-worker shared LAN-cache qualification (issue #4) is deferred to 1.3 by maintainer decision.</w:t>
+        <w:t>Those are bounded implemented slices, not a claim of complete production lifecycle composition. Production command and SSH dispatch, measured real LAN warm-cache hits, remote native-package custody, complete synthetic native-CLI lifecycle proof, and audited legacy-worktree retirement remain open. Production action-DAG dispatch with multi-worker shared-LAN-cache qualification remains deferred to 1.4.</w:t>
       </w:r>
     </w:p>
     <w:p>
@@ -1877,7 +1877,7 @@
           <w:color w:val="101317"/>
           <w:sz w:val="32"/>
         </w:rPr>
-        <w:t>What 1.2 adds: bounded repair, cross-host workers, Mix, and forge coordination</w:t>
+        <w:t>What 1.3 adds: retained source and native custody</w:t>
       </w:r>
     </w:p>
     <w:p>
@@ -1892,7 +1892,7 @@
           <w:color w:val="101317"/>
           <w:sz w:val="24"/>
         </w:rPr>
-        <w:t>litai rebuild now runs bounded candidate repair: a retryable build or generated-test rejection requests up to two fresh replacement candidates, each in its own durable attempt chained to the rejected one, and the rebuild result's repair field reports the replacements that ran. The repair prompt carries only a bounded, sanitized failure fact. Separately, the conformance sample runner retains a bounded, redacted diagnostic excerpt — builder output for build rejections, generated expected and observed values for generated-test mismatches — in retained evidence and in the next attempt's repair feedback. Authority: src/literate_ai/adapters/candidate_repair.py, tests/conformance/support/sample_runner.py, and tests/smoke/test_candidate_rejection_diagnostics.py.</w:t>
+        <w:t>Reviewed first Standard binding and original-source admission preserve an existing receipt policy, historical evidence, and source authority while refusing stale plans, policy weakening, and custom executable-driver replacement. These framework paths do not by themselves grant retained execution or downstream release admission.</w:t>
       </w:r>
     </w:p>
     <w:p>
@@ -1907,7 +1907,7 @@
           <w:color w:val="101317"/>
           <w:sz w:val="24"/>
         </w:rPr>
-        <w:t>When BUILD, TEST, EXECUTE and FINALIZE all run on admitted workers, litai rebuild derives locked toolchain identities, commands and native dependencies from the worker, so the controller needs none of the project's tools. python -m literate_ai.standard_receiver is a reference action receiver for portable single-Component Make/Python Standard projects, and FINALIZE grants are checked in both the receiver's parent and child. Production worker grant provisioning and complete CLI rebuild qualification remain pending. Authority: src/literate_ai/standard_receiver.py and docs/architecture/component-execution-plans.md.</w:t>
+        <w:t>Target-bound Python source projection keeps original source and requirements intact while binding reviewed backend exclusions to exact marker, lock, and source identities. FreeBSD worker and target identities, host observations, and native package foundations also landed, but complete platform and downstream lifecycle admission remain open.</w:t>
       </w:r>
     </w:p>
     <w:p>
@@ -1922,7 +1922,7 @@
           <w:color w:val="101317"/>
           <w:sz w:val="24"/>
         </w:rPr>
-        <w:t>The build-mix Flavor and mix-build-system skill build native Elixir Mix applications and libraries. The source BOM pins each Hex package's exact version, checksums and requirements; ranges are refused, the native lock must equal those pins before anything compiles, and each extracted dependency is replaced by bytes from its verified archive. Mix builds are local-only in 1.2. Authority: flavors/build-mix/ and skills/specification-to-source/mix-build-system/.</w:t>
+        <w:t>Versioned SDK tree, alias, hard-link, package-plan, and topology contracts preserve exact producer and consumer custody through capture, relocation, inspection, and packaging. Retained execution also binds native Windows system context, executable intent, captured runtime paths, scoped secondary identities, and current installed bytes. Decoding or relocating a tree grants no producer, package, or release admission.</w:t>
       </w:r>
     </w:p>
     <w:p>
@@ -1937,7 +1937,7 @@
           <w:color w:val="101317"/>
           <w:sz w:val="24"/>
         </w:rPr>
-        <w:t>Forge issues and pull or merge requests are the default tracker and agent coordination channel; Gerrit or another system is an explicit override (ADR 0050). litai prompt translate recognizes the generic external envelope (literate-ai/prompt-task@2). Remote live gates still require opencode but no longer require OPENAI_API_KEY (ADR 0017 amendment). Skill-catalog discovery now runs once per validation operation, removing most of the filesystem calls that slowed Windows gates. Clean three-way update merging and reviewed resolution application (issue #2) remain deferred to 1.3; in 1.2, conflict review is plan-only and update apply preserves conflicts.</w:t>
+        <w:t>The release sweep defers incomplete work rather than promoting partial native evidence. Windows diagnostics, observation cost, ACL preflight, and fixture repairs move to 1.3.1. Complete FreeBSD admission, Windows ARM64 realization, remote native packaging, production action-DAG and LAN-cache qualification, and broader retained-project contracts move to 1.4.</w:t>
       </w:r>
     </w:p>
     <w:p>
@@ -2102,7 +2102,7 @@
           <w:color w:val="101317"/>
           <w:sz w:val="24"/>
         </w:rPr>
-        <w:t>Use the operator front door on one demanding downstream application and carry it through an explicit retained receipt. Use the next investment cycle for production containment and operational hardening while preserving the architecture needed for many. The requested decision is production-hardening investment plus selection of that first downstream 1.2 production adoption.</w:t>
+        <w:t>Use the operator front door on one demanding downstream application and carry it through an explicit retained receipt. Use the next investment cycle for production containment and operational hardening while preserving the architecture needed for many. The requested decision is production-hardening investment plus selection of that first downstream 1.3 production adoption.</w:t>
       </w:r>
     </w:p>
     <w:p>
@@ -2132,7 +2132,7 @@
           <w:color w:val="101317"/>
           <w:sz w:val="24"/>
         </w:rPr>
-        <w:t>Build for the portfolio from the first application: current gates, no shortcuts, and a regeneratable knowledge system rather than another copied implementation. The presentation and this narrative are the 1.2.0 edition of that argument. They do not grant release authority.</w:t>
+        <w:t>Build for the portfolio from the first application: current gates, no shortcuts, and a regeneratable knowledge system rather than another copied implementation. The presentation and this narrative are the 1.3.0 edition of that argument. They do not grant release authority.</w:t>
       </w:r>
     </w:p>
     <w:sectPr>
@@ -2850,9 +2850,6 @@
     <w:qFormat/>
     <w:rsid w:val="00FC693F"/>
     <w:pPr>
-      <w:pBdr>
-        <w:bottom w:val="single" w:sz="8" w:space="4" w:color="4F81BD" w:themeColor="accent1"/>
-      </w:pBdr>
       <w:spacing w:after="300" w:line="240" w:lineRule="auto"/>
       <w:contextualSpacing/>
     </w:pPr>

</xml_diff>